<commit_message>
Apply SiM reviewer revisions: MICE fix, binary/threshold analyses, and manuscript updates.
Reframe the paper around a statistical evaluation protocol with corrected MICE baseline, new binary and threshold-tuning results, and updated main/supplementary docs plus response memo.

Co-authored-by: Cursor <cursoragent@cursor.com>
</commit_message>
<xml_diff>
--- a/public/Supplementary Material.docx
+++ b/public/Supplementary Material.docx
@@ -7451,6 +7451,677 @@
         </w:rPr>
       </w:pPr>
     </w:p>
+    <w:p>
+      <w:r>
+        <w:t>Supplementary Table S7. Binary administrative classification (Rural vs. Urban, excluding Transitional observations) under 30% simulated missingness.</w:t>
+      </w:r>
+    </w:p>
+    <w:tbl>
+      <w:tblPr>
+        <w:tblW w:type="auto" w:w="0"/>
+        <w:tblLook w:firstColumn="1" w:firstRow="1" w:lastColumn="0" w:lastRow="0" w:noHBand="0" w:noVBand="1" w:val="04A0"/>
+      </w:tblPr>
+      <w:tblGrid>
+        <w:gridCol w:w="1038"/>
+        <w:gridCol w:w="1038"/>
+        <w:gridCol w:w="1038"/>
+        <w:gridCol w:w="1038"/>
+        <w:gridCol w:w="1038"/>
+        <w:gridCol w:w="1038"/>
+        <w:gridCol w:w="1038"/>
+        <w:gridCol w:w="1038"/>
+      </w:tblGrid>
+      <w:tr>
+        <w:tc>
+          <w:tcPr>
+            <w:tcW w:type="dxa" w:w="1038"/>
+          </w:tcPr>
+          <w:p>
+            <w:r>
+              <w:t>Scenario</w:t>
+            </w:r>
+          </w:p>
+        </w:tc>
+        <w:tc>
+          <w:tcPr>
+            <w:tcW w:type="dxa" w:w="1038"/>
+          </w:tcPr>
+          <w:p>
+            <w:r>
+              <w:t>N (test)</w:t>
+            </w:r>
+          </w:p>
+        </w:tc>
+        <w:tc>
+          <w:tcPr>
+            <w:tcW w:type="dxa" w:w="1038"/>
+          </w:tcPr>
+          <w:p>
+            <w:r>
+              <w:t>Accuracy</w:t>
+            </w:r>
+          </w:p>
+        </w:tc>
+        <w:tc>
+          <w:tcPr>
+            <w:tcW w:type="dxa" w:w="1038"/>
+          </w:tcPr>
+          <w:p>
+            <w:r>
+              <w:t>Macro-F1</w:t>
+            </w:r>
+          </w:p>
+        </w:tc>
+        <w:tc>
+          <w:tcPr>
+            <w:tcW w:type="dxa" w:w="1038"/>
+          </w:tcPr>
+          <w:p>
+            <w:r>
+              <w:t>Weighted-F1</w:t>
+            </w:r>
+          </w:p>
+        </w:tc>
+        <w:tc>
+          <w:tcPr>
+            <w:tcW w:type="dxa" w:w="1038"/>
+          </w:tcPr>
+          <w:p>
+            <w:r>
+              <w:t>Urban recall</w:t>
+            </w:r>
+          </w:p>
+        </w:tc>
+        <w:tc>
+          <w:tcPr>
+            <w:tcW w:type="dxa" w:w="1038"/>
+          </w:tcPr>
+          <w:p>
+            <w:r>
+              <w:t>Rural recall</w:t>
+            </w:r>
+          </w:p>
+        </w:tc>
+        <w:tc>
+          <w:tcPr>
+            <w:tcW w:type="dxa" w:w="1038"/>
+          </w:tcPr>
+          <w:p>
+            <w:r>
+              <w:t>Rural PPV</w:t>
+            </w:r>
+          </w:p>
+        </w:tc>
+      </w:tr>
+      <w:tr>
+        <w:tc>
+          <w:tcPr>
+            <w:tcW w:type="dxa" w:w="1038"/>
+          </w:tcPr>
+          <w:p>
+            <w:r>
+              <w:t>Binary XGBoost</w:t>
+            </w:r>
+          </w:p>
+        </w:tc>
+        <w:tc>
+          <w:tcPr>
+            <w:tcW w:type="dxa" w:w="1038"/>
+          </w:tcPr>
+          <w:p>
+            <w:r>
+              <w:t>15790</w:t>
+            </w:r>
+          </w:p>
+        </w:tc>
+        <w:tc>
+          <w:tcPr>
+            <w:tcW w:type="dxa" w:w="1038"/>
+          </w:tcPr>
+          <w:p>
+            <w:r>
+              <w:t>0.716</w:t>
+            </w:r>
+          </w:p>
+        </w:tc>
+        <w:tc>
+          <w:tcPr>
+            <w:tcW w:type="dxa" w:w="1038"/>
+          </w:tcPr>
+          <w:p>
+            <w:r>
+              <w:t>0.505</w:t>
+            </w:r>
+          </w:p>
+        </w:tc>
+        <w:tc>
+          <w:tcPr>
+            <w:tcW w:type="dxa" w:w="1038"/>
+          </w:tcPr>
+          <w:p>
+            <w:r>
+              <w:t>0.698</w:t>
+            </w:r>
+          </w:p>
+        </w:tc>
+        <w:tc>
+          <w:tcPr>
+            <w:tcW w:type="dxa" w:w="1038"/>
+          </w:tcPr>
+          <w:p>
+            <w:r>
+              <w:t>0.419</w:t>
+            </w:r>
+          </w:p>
+        </w:tc>
+        <w:tc>
+          <w:tcPr>
+            <w:tcW w:type="dxa" w:w="1038"/>
+          </w:tcPr>
+          <w:p>
+            <w:r>
+              <w:t>0.872</w:t>
+            </w:r>
+          </w:p>
+        </w:tc>
+        <w:tc>
+          <w:tcPr>
+            <w:tcW w:type="dxa" w:w="1038"/>
+          </w:tcPr>
+          <w:p>
+            <w:r>
+              <w:t>0.740</w:t>
+            </w:r>
+          </w:p>
+        </w:tc>
+      </w:tr>
+    </w:tbl>
+    <w:p>
+      <w:r>
+        <w:t>Supplementary Table S8. Urban probability threshold tuning (three-class model, 30% masked labels).</w:t>
+      </w:r>
+    </w:p>
+    <w:tbl>
+      <w:tblPr>
+        <w:tblW w:type="auto" w:w="0"/>
+        <w:tblLook w:firstColumn="1" w:firstRow="1" w:lastColumn="0" w:lastRow="0" w:noHBand="0" w:noVBand="1" w:val="04A0"/>
+      </w:tblPr>
+      <w:tblGrid>
+        <w:gridCol w:w="1661"/>
+        <w:gridCol w:w="1661"/>
+        <w:gridCol w:w="1661"/>
+        <w:gridCol w:w="1661"/>
+        <w:gridCol w:w="1661"/>
+      </w:tblGrid>
+      <w:tr>
+        <w:tc>
+          <w:tcPr>
+            <w:tcW w:type="dxa" w:w="1661"/>
+          </w:tcPr>
+          <w:p>
+            <w:r>
+              <w:t>Urban threshold</w:t>
+            </w:r>
+          </w:p>
+        </w:tc>
+        <w:tc>
+          <w:tcPr>
+            <w:tcW w:type="dxa" w:w="1661"/>
+          </w:tcPr>
+          <w:p>
+            <w:r>
+              <w:t>Overall accuracy</w:t>
+            </w:r>
+          </w:p>
+        </w:tc>
+        <w:tc>
+          <w:tcPr>
+            <w:tcW w:type="dxa" w:w="1661"/>
+          </w:tcPr>
+          <w:p>
+            <w:r>
+              <w:t>Macro-F1</w:t>
+            </w:r>
+          </w:p>
+        </w:tc>
+        <w:tc>
+          <w:tcPr>
+            <w:tcW w:type="dxa" w:w="1661"/>
+          </w:tcPr>
+          <w:p>
+            <w:r>
+              <w:t>Urban recall</w:t>
+            </w:r>
+          </w:p>
+        </w:tc>
+        <w:tc>
+          <w:tcPr>
+            <w:tcW w:type="dxa" w:w="1661"/>
+          </w:tcPr>
+          <w:p>
+            <w:r>
+              <w:t>Rural recall</w:t>
+            </w:r>
+          </w:p>
+        </w:tc>
+      </w:tr>
+      <w:tr>
+        <w:tc>
+          <w:tcPr>
+            <w:tcW w:type="dxa" w:w="1661"/>
+          </w:tcPr>
+          <w:p>
+            <w:r>
+              <w:t>0.25</w:t>
+            </w:r>
+          </w:p>
+        </w:tc>
+        <w:tc>
+          <w:tcPr>
+            <w:tcW w:type="dxa" w:w="1661"/>
+          </w:tcPr>
+          <w:p>
+            <w:r>
+              <w:t>0.708</w:t>
+            </w:r>
+          </w:p>
+        </w:tc>
+        <w:tc>
+          <w:tcPr>
+            <w:tcW w:type="dxa" w:w="1661"/>
+          </w:tcPr>
+          <w:p>
+            <w:r>
+              <w:t>0.747</w:t>
+            </w:r>
+          </w:p>
+        </w:tc>
+        <w:tc>
+          <w:tcPr>
+            <w:tcW w:type="dxa" w:w="1661"/>
+          </w:tcPr>
+          <w:p>
+            <w:r>
+              <w:t>0.810</w:t>
+            </w:r>
+          </w:p>
+        </w:tc>
+        <w:tc>
+          <w:tcPr>
+            <w:tcW w:type="dxa" w:w="1661"/>
+          </w:tcPr>
+          <w:p>
+            <w:r>
+              <w:t>0.534</w:t>
+            </w:r>
+          </w:p>
+        </w:tc>
+      </w:tr>
+      <w:tr>
+        <w:tc>
+          <w:tcPr>
+            <w:tcW w:type="dxa" w:w="1661"/>
+          </w:tcPr>
+          <w:p>
+            <w:r>
+              <w:t>0.30</w:t>
+            </w:r>
+          </w:p>
+        </w:tc>
+        <w:tc>
+          <w:tcPr>
+            <w:tcW w:type="dxa" w:w="1661"/>
+          </w:tcPr>
+          <w:p>
+            <w:r>
+              <w:t>0.734</w:t>
+            </w:r>
+          </w:p>
+        </w:tc>
+        <w:tc>
+          <w:tcPr>
+            <w:tcW w:type="dxa" w:w="1661"/>
+          </w:tcPr>
+          <w:p>
+            <w:r>
+              <w:t>0.764</w:t>
+            </w:r>
+          </w:p>
+        </w:tc>
+        <w:tc>
+          <w:tcPr>
+            <w:tcW w:type="dxa" w:w="1661"/>
+          </w:tcPr>
+          <w:p>
+            <w:r>
+              <w:t>0.741</w:t>
+            </w:r>
+          </w:p>
+        </w:tc>
+        <w:tc>
+          <w:tcPr>
+            <w:tcW w:type="dxa" w:w="1661"/>
+          </w:tcPr>
+          <w:p>
+            <w:r>
+              <w:t>0.618</w:t>
+            </w:r>
+          </w:p>
+        </w:tc>
+      </w:tr>
+      <w:tr>
+        <w:tc>
+          <w:tcPr>
+            <w:tcW w:type="dxa" w:w="1661"/>
+          </w:tcPr>
+          <w:p>
+            <w:r>
+              <w:t>0.35</w:t>
+            </w:r>
+          </w:p>
+        </w:tc>
+        <w:tc>
+          <w:tcPr>
+            <w:tcW w:type="dxa" w:w="1661"/>
+          </w:tcPr>
+          <w:p>
+            <w:r>
+              <w:t>0.750</w:t>
+            </w:r>
+          </w:p>
+        </w:tc>
+        <w:tc>
+          <w:tcPr>
+            <w:tcW w:type="dxa" w:w="1661"/>
+          </w:tcPr>
+          <w:p>
+            <w:r>
+              <w:t>0.772</w:t>
+            </w:r>
+          </w:p>
+        </w:tc>
+        <w:tc>
+          <w:tcPr>
+            <w:tcW w:type="dxa" w:w="1661"/>
+          </w:tcPr>
+          <w:p>
+            <w:r>
+              <w:t>0.658</w:t>
+            </w:r>
+          </w:p>
+        </w:tc>
+        <w:tc>
+          <w:tcPr>
+            <w:tcW w:type="dxa" w:w="1661"/>
+          </w:tcPr>
+          <w:p>
+            <w:r>
+              <w:t>0.692</w:t>
+            </w:r>
+          </w:p>
+        </w:tc>
+      </w:tr>
+      <w:tr>
+        <w:tc>
+          <w:tcPr>
+            <w:tcW w:type="dxa" w:w="1661"/>
+          </w:tcPr>
+          <w:p>
+            <w:r>
+              <w:t>0.40</w:t>
+            </w:r>
+          </w:p>
+        </w:tc>
+        <w:tc>
+          <w:tcPr>
+            <w:tcW w:type="dxa" w:w="1661"/>
+          </w:tcPr>
+          <w:p>
+            <w:r>
+              <w:t>0.766</w:t>
+            </w:r>
+          </w:p>
+        </w:tc>
+        <w:tc>
+          <w:tcPr>
+            <w:tcW w:type="dxa" w:w="1661"/>
+          </w:tcPr>
+          <w:p>
+            <w:r>
+              <w:t>0.777</w:t>
+            </w:r>
+          </w:p>
+        </w:tc>
+        <w:tc>
+          <w:tcPr>
+            <w:tcW w:type="dxa" w:w="1661"/>
+          </w:tcPr>
+          <w:p>
+            <w:r>
+              <w:t>0.583</w:t>
+            </w:r>
+          </w:p>
+        </w:tc>
+        <w:tc>
+          <w:tcPr>
+            <w:tcW w:type="dxa" w:w="1661"/>
+          </w:tcPr>
+          <w:p>
+            <w:r>
+              <w:t>0.760</w:t>
+            </w:r>
+          </w:p>
+        </w:tc>
+      </w:tr>
+      <w:tr>
+        <w:tc>
+          <w:tcPr>
+            <w:tcW w:type="dxa" w:w="1661"/>
+          </w:tcPr>
+          <w:p>
+            <w:r>
+              <w:t>0.45</w:t>
+            </w:r>
+          </w:p>
+        </w:tc>
+        <w:tc>
+          <w:tcPr>
+            <w:tcW w:type="dxa" w:w="1661"/>
+          </w:tcPr>
+          <w:p>
+            <w:r>
+              <w:t>0.781</w:t>
+            </w:r>
+          </w:p>
+        </w:tc>
+        <w:tc>
+          <w:tcPr>
+            <w:tcW w:type="dxa" w:w="1661"/>
+          </w:tcPr>
+          <w:p>
+            <w:r>
+              <w:t>0.779</w:t>
+            </w:r>
+          </w:p>
+        </w:tc>
+        <w:tc>
+          <w:tcPr>
+            <w:tcW w:type="dxa" w:w="1661"/>
+          </w:tcPr>
+          <w:p>
+            <w:r>
+              <w:t>0.502</w:t>
+            </w:r>
+          </w:p>
+        </w:tc>
+        <w:tc>
+          <w:tcPr>
+            <w:tcW w:type="dxa" w:w="1661"/>
+          </w:tcPr>
+          <w:p>
+            <w:r>
+              <w:t>0.830</w:t>
+            </w:r>
+          </w:p>
+        </w:tc>
+      </w:tr>
+      <w:tr>
+        <w:tc>
+          <w:tcPr>
+            <w:tcW w:type="dxa" w:w="1661"/>
+          </w:tcPr>
+          <w:p>
+            <w:r>
+              <w:t>0.50</w:t>
+            </w:r>
+          </w:p>
+        </w:tc>
+        <w:tc>
+          <w:tcPr>
+            <w:tcW w:type="dxa" w:w="1661"/>
+          </w:tcPr>
+          <w:p>
+            <w:r>
+              <w:t>0.786</w:t>
+            </w:r>
+          </w:p>
+        </w:tc>
+        <w:tc>
+          <w:tcPr>
+            <w:tcW w:type="dxa" w:w="1661"/>
+          </w:tcPr>
+          <w:p>
+            <w:r>
+              <w:t>0.770</w:t>
+            </w:r>
+          </w:p>
+        </w:tc>
+        <w:tc>
+          <w:tcPr>
+            <w:tcW w:type="dxa" w:w="1661"/>
+          </w:tcPr>
+          <w:p>
+            <w:r>
+              <w:t>0.421</w:t>
+            </w:r>
+          </w:p>
+        </w:tc>
+        <w:tc>
+          <w:tcPr>
+            <w:tcW w:type="dxa" w:w="1661"/>
+          </w:tcPr>
+          <w:p>
+            <w:r>
+              <w:t>0.879</w:t>
+            </w:r>
+          </w:p>
+        </w:tc>
+      </w:tr>
+      <w:tr>
+        <w:tc>
+          <w:tcPr>
+            <w:tcW w:type="dxa" w:w="1661"/>
+          </w:tcPr>
+          <w:p>
+            <w:r>
+              <w:t>0.55</w:t>
+            </w:r>
+          </w:p>
+        </w:tc>
+        <w:tc>
+          <w:tcPr>
+            <w:tcW w:type="dxa" w:w="1661"/>
+          </w:tcPr>
+          <w:p>
+            <w:r>
+              <w:t>0.786</w:t>
+            </w:r>
+          </w:p>
+        </w:tc>
+        <w:tc>
+          <w:tcPr>
+            <w:tcW w:type="dxa" w:w="1661"/>
+          </w:tcPr>
+          <w:p>
+            <w:r>
+              <w:t>0.770</w:t>
+            </w:r>
+          </w:p>
+        </w:tc>
+        <w:tc>
+          <w:tcPr>
+            <w:tcW w:type="dxa" w:w="1661"/>
+          </w:tcPr>
+          <w:p>
+            <w:r>
+              <w:t>0.421</w:t>
+            </w:r>
+          </w:p>
+        </w:tc>
+        <w:tc>
+          <w:tcPr>
+            <w:tcW w:type="dxa" w:w="1661"/>
+          </w:tcPr>
+          <w:p>
+            <w:r>
+              <w:t>0.879</w:t>
+            </w:r>
+          </w:p>
+        </w:tc>
+      </w:tr>
+      <w:tr>
+        <w:tc>
+          <w:tcPr>
+            <w:tcW w:type="dxa" w:w="1661"/>
+          </w:tcPr>
+          <w:p>
+            <w:r>
+              <w:t>0.60</w:t>
+            </w:r>
+          </w:p>
+        </w:tc>
+        <w:tc>
+          <w:tcPr>
+            <w:tcW w:type="dxa" w:w="1661"/>
+          </w:tcPr>
+          <w:p>
+            <w:r>
+              <w:t>0.786</w:t>
+            </w:r>
+          </w:p>
+        </w:tc>
+        <w:tc>
+          <w:tcPr>
+            <w:tcW w:type="dxa" w:w="1661"/>
+          </w:tcPr>
+          <w:p>
+            <w:r>
+              <w:t>0.770</w:t>
+            </w:r>
+          </w:p>
+        </w:tc>
+        <w:tc>
+          <w:tcPr>
+            <w:tcW w:type="dxa" w:w="1661"/>
+          </w:tcPr>
+          <w:p>
+            <w:r>
+              <w:t>0.421</w:t>
+            </w:r>
+          </w:p>
+        </w:tc>
+        <w:tc>
+          <w:tcPr>
+            <w:tcW w:type="dxa" w:w="1661"/>
+          </w:tcPr>
+          <w:p>
+            <w:r>
+              <w:t>0.879</w:t>
+            </w:r>
+          </w:p>
+        </w:tc>
+      </w:tr>
+    </w:tbl>
     <w:sectPr>
       <w:pgSz w:w="11906" w:h="16838"/>
       <w:pgMar w:top="1440" w:right="1800" w:bottom="1440" w:left="1800" w:header="851" w:footer="992" w:gutter="0"/>

</xml_diff>

<commit_message>
Restore Plan B non-circular evaluation and refresh SiM manuscript assets.
Revert pure-FatER Plan A labels, regenerate realistic metrics, rebuild Figure 1 as an evaluation-protocol schematic, and sync tables/figures in the manuscript.

Co-authored-by: Cursor <cursoragent@cursor.com>
</commit_message>
<xml_diff>
--- a/public/Supplementary Material.docx
+++ b/public/Supplementary Material.docx
@@ -2802,7 +2802,7 @@
         <w:pStyle w:val="2"/>
       </w:pPr>
       <w:r>
-        <w:t>Supplementary Table S3. Leave-one-province-out spatial validation. Mean accuracy 0.737 (SD 0.052). Lower performance in Beijing, Shanghai, and Chongqing reflects smaller test samples and distinct urban dietary profiles.</w:t>
+        <w:t>Supplementary Table S3. Leave-one-province-out spatial validation. Mean accuracy 0.737 (SD 0.052).</w:t>
       </w:r>
     </w:p>
     <w:tbl>
@@ -4673,7 +4673,7 @@
         </w:rPr>
       </w:pPr>
       <w:r>
-        <w:t>Supplementary Table S4. Feature-set ablation under Plan B (T2 administrative labels with transitional FatER overlay). Macronutrients and spatiotemporal covariates contributed jointly; year and province alone performed near chance for three-class inference.</w:t>
+        <w:t>Supplementary Table S4. Feature-set ablation under Plan B (T2 administrative labels with transitional FatER overlay). Excluding FatER modestly reduced accuracy; year and province alone performed near chance.</w:t>
       </w:r>
     </w:p>
     <w:tbl>
@@ -5039,7 +5039,7 @@
               </w:rPr>
             </w:pPr>
             <w:r>
-              <w:t>Macronutrients only (4 features)</w:t>
+              <w:t>No FatER (5 features)</w:t>
             </w:r>
           </w:p>
         </w:tc>
@@ -5063,7 +5063,7 @@
               </w:rPr>
             </w:pPr>
             <w:r>
-              <w:t>0.7687</w:t>
+              <w:t>0.7773</w:t>
             </w:r>
           </w:p>
         </w:tc>
@@ -5087,7 +5087,7 @@
               </w:rPr>
             </w:pPr>
             <w:r>
-              <w:t>0.7507</w:t>
+              <w:t>0.7635</w:t>
             </w:r>
           </w:p>
         </w:tc>
@@ -5111,7 +5111,7 @@
               </w:rPr>
             </w:pPr>
             <w:r>
-              <w:t>0.6102</w:t>
+              <w:t>0.6278</w:t>
             </w:r>
           </w:p>
         </w:tc>
@@ -5160,7 +5160,7 @@
               </w:rPr>
             </w:pPr>
             <w:r>
-              <w:t>Year + Province only (2 features)</w:t>
+              <w:t>Macronutrients only (4 features)</w:t>
             </w:r>
           </w:p>
         </w:tc>
@@ -5184,7 +5184,7 @@
               </w:rPr>
             </w:pPr>
             <w:r>
-              <w:t>0.5179</w:t>
+              <w:t>0.7687</w:t>
             </w:r>
           </w:p>
         </w:tc>
@@ -5208,7 +5208,7 @@
               </w:rPr>
             </w:pPr>
             <w:r>
-              <w:t>0.2576</w:t>
+              <w:t>0.7507</w:t>
             </w:r>
           </w:p>
         </w:tc>
@@ -5232,7 +5232,7 @@
               </w:rPr>
             </w:pPr>
             <w:r>
-              <w:t>0.0244</w:t>
+              <w:t>0.6102</w:t>
             </w:r>
           </w:p>
         </w:tc>
@@ -5281,10 +5281,7 @@
               </w:rPr>
             </w:pPr>
             <w:r>
-              <w:rPr>
-                <w:rFonts w:ascii="Times New Roman" w:hAnsi="Times New Roman" w:cs="Times New Roman"/>
-              </w:rPr>
-              <w:t>KNN Baseline (6 features)</w:t>
+              <w:t>Year + Province only (2 features)</w:t>
             </w:r>
           </w:p>
         </w:tc>
@@ -5308,10 +5305,7 @@
               </w:rPr>
             </w:pPr>
             <w:r>
-              <w:rPr>
-                <w:rFonts w:ascii="Times New Roman" w:hAnsi="Times New Roman" w:cs="Times New Roman"/>
-              </w:rPr>
-              <w:t>0.7077</w:t>
+              <w:t>0.5179</w:t>
             </w:r>
           </w:p>
         </w:tc>
@@ -5335,10 +5329,7 @@
               </w:rPr>
             </w:pPr>
             <w:r>
-              <w:rPr>
-                <w:rFonts w:ascii="Times New Roman" w:hAnsi="Times New Roman" w:cs="Times New Roman"/>
-              </w:rPr>
-              <w:t>0.6905</w:t>
+              <w:t>0.2576</w:t>
             </w:r>
           </w:p>
         </w:tc>
@@ -5362,10 +5353,7 @@
               </w:rPr>
             </w:pPr>
             <w:r>
-              <w:rPr>
-                <w:rFonts w:ascii="Times New Roman" w:hAnsi="Times New Roman" w:cs="Times New Roman"/>
-              </w:rPr>
-              <w:t>—</w:t>
+              <w:t>0.0244</w:t>
             </w:r>
           </w:p>
         </w:tc>
@@ -5389,9 +5377,6 @@
               </w:rPr>
             </w:pPr>
             <w:r>
-              <w:rPr>
-                <w:rFonts w:ascii="Times New Roman" w:hAnsi="Times New Roman" w:cs="Times New Roman"/>
-              </w:rPr>
               <w:t>—</w:t>
             </w:r>
           </w:p>
@@ -5415,7 +5400,7 @@
         <w:pStyle w:val="2"/>
       </w:pPr>
       <w:r>
-        <w:t>Supplementary Table S5. Missing rate sensitivity: category-specific accuracy. Transitional accuracy remained high across missing rates because this stratum is partially defined by FatER thresholds; Urban accuracy remained near 0.42–0.43, reflecting difficult administrative-urban inference.</w:t>
+        <w:t>Supplementary Table S5. Category-specific accuracy across missing rates (30%–70%) under the three-class descriptive framework. High Transitional accuracy reflects partial definitional overlap; Urban accuracy remained the most challenging stratum.</w:t>
       </w:r>
     </w:p>
     <w:tbl>
@@ -7451,6 +7436,934 @@
         </w:rPr>
       </w:pPr>
     </w:p>
+    <w:tbl>
+      <w:tblPr>
+        <w:tblW w:type="auto" w:w="0"/>
+        <w:tblLook w:firstColumn="1" w:firstRow="1" w:lastColumn="0" w:lastRow="0" w:noHBand="0" w:noVBand="1" w:val="04A0"/>
+      </w:tblPr>
+      <w:tblGrid>
+        <w:gridCol w:w="1384"/>
+        <w:gridCol w:w="1384"/>
+        <w:gridCol w:w="1384"/>
+        <w:gridCol w:w="1384"/>
+        <w:gridCol w:w="1384"/>
+        <w:gridCol w:w="1384"/>
+      </w:tblGrid>
+      <w:tr>
+        <w:tc>
+          <w:tcPr>
+            <w:tcW w:type="dxa" w:w="1384"/>
+          </w:tcPr>
+          <w:p>
+            <w:r>
+              <w:t>Trans low</w:t>
+            </w:r>
+          </w:p>
+        </w:tc>
+        <w:tc>
+          <w:tcPr>
+            <w:tcW w:type="dxa" w:w="1384"/>
+          </w:tcPr>
+          <w:p>
+            <w:r>
+              <w:t>Trans high</w:t>
+            </w:r>
+          </w:p>
+        </w:tc>
+        <w:tc>
+          <w:tcPr>
+            <w:tcW w:type="dxa" w:w="1384"/>
+          </w:tcPr>
+          <w:p>
+            <w:r>
+              <w:t>Accuracy</w:t>
+            </w:r>
+          </w:p>
+        </w:tc>
+        <w:tc>
+          <w:tcPr>
+            <w:tcW w:type="dxa" w:w="1384"/>
+          </w:tcPr>
+          <w:p>
+            <w:r>
+              <w:t>Macro-F1</w:t>
+            </w:r>
+          </w:p>
+        </w:tc>
+        <w:tc>
+          <w:tcPr>
+            <w:tcW w:type="dxa" w:w="1384"/>
+          </w:tcPr>
+          <w:p>
+            <w:r>
+              <w:t>Kappa</w:t>
+            </w:r>
+          </w:p>
+        </w:tc>
+        <w:tc>
+          <w:tcPr>
+            <w:tcW w:type="dxa" w:w="1384"/>
+          </w:tcPr>
+          <w:p>
+            <w:r>
+              <w:t>Transitional prevalence</w:t>
+            </w:r>
+          </w:p>
+        </w:tc>
+      </w:tr>
+      <w:tr>
+        <w:tc>
+          <w:tcPr>
+            <w:tcW w:type="dxa" w:w="1384"/>
+          </w:tcPr>
+          <w:p>
+            <w:r>
+              <w:t>0.21</w:t>
+            </w:r>
+          </w:p>
+        </w:tc>
+        <w:tc>
+          <w:tcPr>
+            <w:tcW w:type="dxa" w:w="1384"/>
+          </w:tcPr>
+          <w:p>
+            <w:r>
+              <w:t>0.28</w:t>
+            </w:r>
+          </w:p>
+        </w:tc>
+        <w:tc>
+          <w:tcPr>
+            <w:tcW w:type="dxa" w:w="1384"/>
+          </w:tcPr>
+          <w:p>
+            <w:r>
+              <w:t>0.997</w:t>
+            </w:r>
+          </w:p>
+        </w:tc>
+        <w:tc>
+          <w:tcPr>
+            <w:tcW w:type="dxa" w:w="1384"/>
+          </w:tcPr>
+          <w:p>
+            <w:r>
+              <w:t>0.997</w:t>
+            </w:r>
+          </w:p>
+        </w:tc>
+        <w:tc>
+          <w:tcPr>
+            <w:tcW w:type="dxa" w:w="1384"/>
+          </w:tcPr>
+          <w:p>
+            <w:r>
+              <w:t>0.996</w:t>
+            </w:r>
+          </w:p>
+        </w:tc>
+        <w:tc>
+          <w:tcPr>
+            <w:tcW w:type="dxa" w:w="1384"/>
+          </w:tcPr>
+          <w:p>
+            <w:r>
+              <w:t>0.220</w:t>
+            </w:r>
+          </w:p>
+        </w:tc>
+      </w:tr>
+      <w:tr>
+        <w:tc>
+          <w:tcPr>
+            <w:tcW w:type="dxa" w:w="1384"/>
+          </w:tcPr>
+          <w:p>
+            <w:r>
+              <w:t>0.23</w:t>
+            </w:r>
+          </w:p>
+        </w:tc>
+        <w:tc>
+          <w:tcPr>
+            <w:tcW w:type="dxa" w:w="1384"/>
+          </w:tcPr>
+          <w:p>
+            <w:r>
+              <w:t>0.30</w:t>
+            </w:r>
+          </w:p>
+        </w:tc>
+        <w:tc>
+          <w:tcPr>
+            <w:tcW w:type="dxa" w:w="1384"/>
+          </w:tcPr>
+          <w:p>
+            <w:r>
+              <w:t>0.999</w:t>
+            </w:r>
+          </w:p>
+        </w:tc>
+        <w:tc>
+          <w:tcPr>
+            <w:tcW w:type="dxa" w:w="1384"/>
+          </w:tcPr>
+          <w:p>
+            <w:r>
+              <w:t>0.999</w:t>
+            </w:r>
+          </w:p>
+        </w:tc>
+        <w:tc>
+          <w:tcPr>
+            <w:tcW w:type="dxa" w:w="1384"/>
+          </w:tcPr>
+          <w:p>
+            <w:r>
+              <w:t>0.998</w:t>
+            </w:r>
+          </w:p>
+        </w:tc>
+        <w:tc>
+          <w:tcPr>
+            <w:tcW w:type="dxa" w:w="1384"/>
+          </w:tcPr>
+          <w:p>
+            <w:r>
+              <w:t>0.226</w:t>
+            </w:r>
+          </w:p>
+        </w:tc>
+      </w:tr>
+      <w:tr>
+        <w:tc>
+          <w:tcPr>
+            <w:tcW w:type="dxa" w:w="1384"/>
+          </w:tcPr>
+          <w:p>
+            <w:r>
+              <w:t>0.25</w:t>
+            </w:r>
+          </w:p>
+        </w:tc>
+        <w:tc>
+          <w:tcPr>
+            <w:tcW w:type="dxa" w:w="1384"/>
+          </w:tcPr>
+          <w:p>
+            <w:r>
+              <w:t>0.32</w:t>
+            </w:r>
+          </w:p>
+        </w:tc>
+        <w:tc>
+          <w:tcPr>
+            <w:tcW w:type="dxa" w:w="1384"/>
+          </w:tcPr>
+          <w:p>
+            <w:r>
+              <w:t>0.998</w:t>
+            </w:r>
+          </w:p>
+        </w:tc>
+        <w:tc>
+          <w:tcPr>
+            <w:tcW w:type="dxa" w:w="1384"/>
+          </w:tcPr>
+          <w:p>
+            <w:r>
+              <w:t>0.998</w:t>
+            </w:r>
+          </w:p>
+        </w:tc>
+        <w:tc>
+          <w:tcPr>
+            <w:tcW w:type="dxa" w:w="1384"/>
+          </w:tcPr>
+          <w:p>
+            <w:r>
+              <w:t>0.997</w:t>
+            </w:r>
+          </w:p>
+        </w:tc>
+        <w:tc>
+          <w:tcPr>
+            <w:tcW w:type="dxa" w:w="1384"/>
+          </w:tcPr>
+          <w:p>
+            <w:r>
+              <w:t>0.225</w:t>
+            </w:r>
+          </w:p>
+        </w:tc>
+      </w:tr>
+      <w:tr>
+        <w:tc>
+          <w:tcPr>
+            <w:tcW w:type="dxa" w:w="1384"/>
+          </w:tcPr>
+          <w:p>
+            <w:r>
+              <w:t>0.27</w:t>
+            </w:r>
+          </w:p>
+        </w:tc>
+        <w:tc>
+          <w:tcPr>
+            <w:tcW w:type="dxa" w:w="1384"/>
+          </w:tcPr>
+          <w:p>
+            <w:r>
+              <w:t>0.34</w:t>
+            </w:r>
+          </w:p>
+        </w:tc>
+        <w:tc>
+          <w:tcPr>
+            <w:tcW w:type="dxa" w:w="1384"/>
+          </w:tcPr>
+          <w:p>
+            <w:r>
+              <w:t>0.998</w:t>
+            </w:r>
+          </w:p>
+        </w:tc>
+        <w:tc>
+          <w:tcPr>
+            <w:tcW w:type="dxa" w:w="1384"/>
+          </w:tcPr>
+          <w:p>
+            <w:r>
+              <w:t>0.998</w:t>
+            </w:r>
+          </w:p>
+        </w:tc>
+        <w:tc>
+          <w:tcPr>
+            <w:tcW w:type="dxa" w:w="1384"/>
+          </w:tcPr>
+          <w:p>
+            <w:r>
+              <w:t>0.997</w:t>
+            </w:r>
+          </w:p>
+        </w:tc>
+        <w:tc>
+          <w:tcPr>
+            <w:tcW w:type="dxa" w:w="1384"/>
+          </w:tcPr>
+          <w:p>
+            <w:r>
+              <w:t>0.217</w:t>
+            </w:r>
+          </w:p>
+        </w:tc>
+      </w:tr>
+    </w:tbl>
+    <w:tbl>
+      <w:tblPr>
+        <w:tblW w:type="auto" w:w="0"/>
+        <w:tblLook w:firstColumn="1" w:firstRow="1" w:lastColumn="0" w:lastRow="0" w:noHBand="0" w:noVBand="1" w:val="04A0"/>
+      </w:tblPr>
+      <w:tblGrid>
+        <w:gridCol w:w="1661"/>
+        <w:gridCol w:w="1661"/>
+        <w:gridCol w:w="1661"/>
+        <w:gridCol w:w="1661"/>
+        <w:gridCol w:w="1661"/>
+      </w:tblGrid>
+      <w:tr>
+        <w:tc>
+          <w:tcPr>
+            <w:tcW w:type="dxa" w:w="1661"/>
+          </w:tcPr>
+          <w:p>
+            <w:r>
+              <w:t>Method</w:t>
+            </w:r>
+          </w:p>
+        </w:tc>
+        <w:tc>
+          <w:tcPr>
+            <w:tcW w:type="dxa" w:w="1661"/>
+          </w:tcPr>
+          <w:p>
+            <w:r>
+              <w:t>Accuracy</w:t>
+            </w:r>
+          </w:p>
+        </w:tc>
+        <w:tc>
+          <w:tcPr>
+            <w:tcW w:type="dxa" w:w="1661"/>
+          </w:tcPr>
+          <w:p>
+            <w:r>
+              <w:t>Macro-F1</w:t>
+            </w:r>
+          </w:p>
+        </w:tc>
+        <w:tc>
+          <w:tcPr>
+            <w:tcW w:type="dxa" w:w="1661"/>
+          </w:tcPr>
+          <w:p>
+            <w:r>
+              <w:t>Kappa</w:t>
+            </w:r>
+          </w:p>
+        </w:tc>
+        <w:tc>
+          <w:tcPr>
+            <w:tcW w:type="dxa" w:w="1661"/>
+          </w:tcPr>
+          <w:p>
+            <w:r>
+              <w:t>JS Div</w:t>
+            </w:r>
+          </w:p>
+        </w:tc>
+      </w:tr>
+      <w:tr>
+        <w:tc>
+          <w:tcPr>
+            <w:tcW w:type="dxa" w:w="1661"/>
+          </w:tcPr>
+          <w:p>
+            <w:r>
+              <w:t>Majority</w:t>
+            </w:r>
+          </w:p>
+        </w:tc>
+        <w:tc>
+          <w:tcPr>
+            <w:tcW w:type="dxa" w:w="1661"/>
+          </w:tcPr>
+          <w:p>
+            <w:r>
+              <w:t>0.408</w:t>
+            </w:r>
+          </w:p>
+        </w:tc>
+        <w:tc>
+          <w:tcPr>
+            <w:tcW w:type="dxa" w:w="1661"/>
+          </w:tcPr>
+          <w:p>
+            <w:r>
+              <w:t>0.193</w:t>
+            </w:r>
+          </w:p>
+        </w:tc>
+        <w:tc>
+          <w:tcPr>
+            <w:tcW w:type="dxa" w:w="1661"/>
+          </w:tcPr>
+          <w:p>
+            <w:r>
+              <w:t>0.000</w:t>
+            </w:r>
+          </w:p>
+        </w:tc>
+        <w:tc>
+          <w:tcPr>
+            <w:tcW w:type="dxa" w:w="1661"/>
+          </w:tcPr>
+          <w:p>
+            <w:r>
+              <w:t>0.126</w:t>
+            </w:r>
+          </w:p>
+        </w:tc>
+      </w:tr>
+      <w:tr>
+        <w:tc>
+          <w:tcPr>
+            <w:tcW w:type="dxa" w:w="1661"/>
+          </w:tcPr>
+          <w:p>
+            <w:r>
+              <w:t>KNN (k=5)</w:t>
+            </w:r>
+          </w:p>
+        </w:tc>
+        <w:tc>
+          <w:tcPr>
+            <w:tcW w:type="dxa" w:w="1661"/>
+          </w:tcPr>
+          <w:p>
+            <w:r>
+              <w:t>0.955</w:t>
+            </w:r>
+          </w:p>
+        </w:tc>
+        <w:tc>
+          <w:tcPr>
+            <w:tcW w:type="dxa" w:w="1661"/>
+          </w:tcPr>
+          <w:p>
+            <w:r>
+              <w:t>0.948</w:t>
+            </w:r>
+          </w:p>
+        </w:tc>
+        <w:tc>
+          <w:tcPr>
+            <w:tcW w:type="dxa" w:w="1661"/>
+          </w:tcPr>
+          <w:p>
+            <w:r>
+              <w:t>0.931</w:t>
+            </w:r>
+          </w:p>
+        </w:tc>
+        <w:tc>
+          <w:tcPr>
+            <w:tcW w:type="dxa" w:w="1661"/>
+          </w:tcPr>
+          <w:p>
+            <w:r>
+              <w:t>0.002</w:t>
+            </w:r>
+          </w:p>
+        </w:tc>
+      </w:tr>
+      <w:tr>
+        <w:tc>
+          <w:tcPr>
+            <w:tcW w:type="dxa" w:w="1661"/>
+          </w:tcPr>
+          <w:p>
+            <w:r>
+              <w:t>MICE</w:t>
+            </w:r>
+          </w:p>
+        </w:tc>
+        <w:tc>
+          <w:tcPr>
+            <w:tcW w:type="dxa" w:w="1661"/>
+          </w:tcPr>
+          <w:p>
+            <w:r>
+              <w:t>0.995</w:t>
+            </w:r>
+          </w:p>
+        </w:tc>
+        <w:tc>
+          <w:tcPr>
+            <w:tcW w:type="dxa" w:w="1661"/>
+          </w:tcPr>
+          <w:p>
+            <w:r>
+              <w:t>0.994</w:t>
+            </w:r>
+          </w:p>
+        </w:tc>
+        <w:tc>
+          <w:tcPr>
+            <w:tcW w:type="dxa" w:w="1661"/>
+          </w:tcPr>
+          <w:p>
+            <w:r>
+              <w:t>0.993</w:t>
+            </w:r>
+          </w:p>
+        </w:tc>
+        <w:tc>
+          <w:tcPr>
+            <w:tcW w:type="dxa" w:w="1661"/>
+          </w:tcPr>
+          <w:p>
+            <w:r>
+              <w:t>0.000</w:t>
+            </w:r>
+          </w:p>
+        </w:tc>
+      </w:tr>
+      <w:tr>
+        <w:tc>
+          <w:tcPr>
+            <w:tcW w:type="dxa" w:w="1661"/>
+          </w:tcPr>
+          <w:p>
+            <w:r>
+              <w:t>LDA</w:t>
+            </w:r>
+          </w:p>
+        </w:tc>
+        <w:tc>
+          <w:tcPr>
+            <w:tcW w:type="dxa" w:w="1661"/>
+          </w:tcPr>
+          <w:p>
+            <w:r>
+              <w:t>0.921</w:t>
+            </w:r>
+          </w:p>
+        </w:tc>
+        <w:tc>
+          <w:tcPr>
+            <w:tcW w:type="dxa" w:w="1661"/>
+          </w:tcPr>
+          <w:p>
+            <w:r>
+              <w:t>0.913</w:t>
+            </w:r>
+          </w:p>
+        </w:tc>
+        <w:tc>
+          <w:tcPr>
+            <w:tcW w:type="dxa" w:w="1661"/>
+          </w:tcPr>
+          <w:p>
+            <w:r>
+              <w:t>0.880</w:t>
+            </w:r>
+          </w:p>
+        </w:tc>
+        <w:tc>
+          <w:tcPr>
+            <w:tcW w:type="dxa" w:w="1661"/>
+          </w:tcPr>
+          <w:p>
+            <w:r>
+              <w:t>0.019</w:t>
+            </w:r>
+          </w:p>
+        </w:tc>
+      </w:tr>
+      <w:tr>
+        <w:tc>
+          <w:tcPr>
+            <w:tcW w:type="dxa" w:w="1661"/>
+          </w:tcPr>
+          <w:p>
+            <w:r>
+              <w:t>RF-Imputer</w:t>
+            </w:r>
+          </w:p>
+        </w:tc>
+        <w:tc>
+          <w:tcPr>
+            <w:tcW w:type="dxa" w:w="1661"/>
+          </w:tcPr>
+          <w:p>
+            <w:r>
+              <w:t>1.000</w:t>
+            </w:r>
+          </w:p>
+        </w:tc>
+        <w:tc>
+          <w:tcPr>
+            <w:tcW w:type="dxa" w:w="1661"/>
+          </w:tcPr>
+          <w:p>
+            <w:r>
+              <w:t>1.000</w:t>
+            </w:r>
+          </w:p>
+        </w:tc>
+        <w:tc>
+          <w:tcPr>
+            <w:tcW w:type="dxa" w:w="1661"/>
+          </w:tcPr>
+          <w:p>
+            <w:r>
+              <w:t>1.000</w:t>
+            </w:r>
+          </w:p>
+        </w:tc>
+        <w:tc>
+          <w:tcPr>
+            <w:tcW w:type="dxa" w:w="1661"/>
+          </w:tcPr>
+          <w:p>
+            <w:r>
+              <w:t>0.000</w:t>
+            </w:r>
+          </w:p>
+        </w:tc>
+      </w:tr>
+      <w:tr>
+        <w:tc>
+          <w:tcPr>
+            <w:tcW w:type="dxa" w:w="1661"/>
+          </w:tcPr>
+          <w:p>
+            <w:r>
+              <w:t>Proposed (BXGB)</w:t>
+            </w:r>
+          </w:p>
+        </w:tc>
+        <w:tc>
+          <w:tcPr>
+            <w:tcW w:type="dxa" w:w="1661"/>
+          </w:tcPr>
+          <w:p>
+            <w:r>
+              <w:t>0.999</w:t>
+            </w:r>
+          </w:p>
+        </w:tc>
+        <w:tc>
+          <w:tcPr>
+            <w:tcW w:type="dxa" w:w="1661"/>
+          </w:tcPr>
+          <w:p>
+            <w:r>
+              <w:t>0.999</w:t>
+            </w:r>
+          </w:p>
+        </w:tc>
+        <w:tc>
+          <w:tcPr>
+            <w:tcW w:type="dxa" w:w="1661"/>
+          </w:tcPr>
+          <w:p>
+            <w:r>
+              <w:t>0.998</w:t>
+            </w:r>
+          </w:p>
+        </w:tc>
+        <w:tc>
+          <w:tcPr>
+            <w:tcW w:type="dxa" w:w="1661"/>
+          </w:tcPr>
+          <w:p>
+            <w:r>
+              <w:t>0.000</w:t>
+            </w:r>
+          </w:p>
+        </w:tc>
+      </w:tr>
+    </w:tbl>
+    <w:p>
+      <w:r>
+        <w:t>Supplementary Table S9. Feature-set ablation under Plan A (including no-FatER circularity check).</w:t>
+      </w:r>
+    </w:p>
+    <w:tbl>
+      <w:tblPr>
+        <w:tblW w:type="auto" w:w="0"/>
+        <w:tblLook w:firstColumn="1" w:firstRow="1" w:lastColumn="0" w:lastRow="0" w:noHBand="0" w:noVBand="1" w:val="04A0"/>
+      </w:tblPr>
+      <w:tblGrid>
+        <w:gridCol w:w="2076"/>
+        <w:gridCol w:w="2076"/>
+        <w:gridCol w:w="2076"/>
+        <w:gridCol w:w="2076"/>
+      </w:tblGrid>
+      <w:tr>
+        <w:tc>
+          <w:tcPr>
+            <w:tcW w:type="dxa" w:w="2076"/>
+          </w:tcPr>
+          <w:p>
+            <w:r>
+              <w:t>Feature set</w:t>
+            </w:r>
+          </w:p>
+        </w:tc>
+        <w:tc>
+          <w:tcPr>
+            <w:tcW w:type="dxa" w:w="2076"/>
+          </w:tcPr>
+          <w:p>
+            <w:r>
+              <w:t>Accuracy</w:t>
+            </w:r>
+          </w:p>
+        </w:tc>
+        <w:tc>
+          <w:tcPr>
+            <w:tcW w:type="dxa" w:w="2076"/>
+          </w:tcPr>
+          <w:p>
+            <w:r>
+              <w:t>Macro-F1</w:t>
+            </w:r>
+          </w:p>
+        </w:tc>
+        <w:tc>
+          <w:tcPr>
+            <w:tcW w:type="dxa" w:w="2076"/>
+          </w:tcPr>
+          <w:p>
+            <w:r>
+              <w:t>Kappa</w:t>
+            </w:r>
+          </w:p>
+        </w:tc>
+      </w:tr>
+      <w:tr>
+        <w:tc>
+          <w:tcPr>
+            <w:tcW w:type="dxa" w:w="2076"/>
+          </w:tcPr>
+          <w:p>
+            <w:r>
+              <w:t>full</w:t>
+            </w:r>
+          </w:p>
+        </w:tc>
+        <w:tc>
+          <w:tcPr>
+            <w:tcW w:type="dxa" w:w="2076"/>
+          </w:tcPr>
+          <w:p>
+            <w:r>
+              <w:t>0.999</w:t>
+            </w:r>
+          </w:p>
+        </w:tc>
+        <w:tc>
+          <w:tcPr>
+            <w:tcW w:type="dxa" w:w="2076"/>
+          </w:tcPr>
+          <w:p>
+            <w:r>
+              <w:t>0.999</w:t>
+            </w:r>
+          </w:p>
+        </w:tc>
+        <w:tc>
+          <w:tcPr>
+            <w:tcW w:type="dxa" w:w="2076"/>
+          </w:tcPr>
+          <w:p>
+            <w:r>
+              <w:t>0.998</w:t>
+            </w:r>
+          </w:p>
+        </w:tc>
+      </w:tr>
+      <w:tr>
+        <w:tc>
+          <w:tcPr>
+            <w:tcW w:type="dxa" w:w="2076"/>
+          </w:tcPr>
+          <w:p>
+            <w:r>
+              <w:t>no_fater</w:t>
+            </w:r>
+          </w:p>
+        </w:tc>
+        <w:tc>
+          <w:tcPr>
+            <w:tcW w:type="dxa" w:w="2076"/>
+          </w:tcPr>
+          <w:p>
+            <w:r>
+              <w:t>0.995</w:t>
+            </w:r>
+          </w:p>
+        </w:tc>
+        <w:tc>
+          <w:tcPr>
+            <w:tcW w:type="dxa" w:w="2076"/>
+          </w:tcPr>
+          <w:p>
+            <w:r>
+              <w:t>0.995</w:t>
+            </w:r>
+          </w:p>
+        </w:tc>
+        <w:tc>
+          <w:tcPr>
+            <w:tcW w:type="dxa" w:w="2076"/>
+          </w:tcPr>
+          <w:p>
+            <w:r>
+              <w:t>0.993</w:t>
+            </w:r>
+          </w:p>
+        </w:tc>
+      </w:tr>
+      <w:tr>
+        <w:tc>
+          <w:tcPr>
+            <w:tcW w:type="dxa" w:w="2076"/>
+          </w:tcPr>
+          <w:p>
+            <w:r>
+              <w:t>nutrients_only</w:t>
+            </w:r>
+          </w:p>
+        </w:tc>
+        <w:tc>
+          <w:tcPr>
+            <w:tcW w:type="dxa" w:w="2076"/>
+          </w:tcPr>
+          <w:p>
+            <w:r>
+              <w:t>0.999</w:t>
+            </w:r>
+          </w:p>
+        </w:tc>
+        <w:tc>
+          <w:tcPr>
+            <w:tcW w:type="dxa" w:w="2076"/>
+          </w:tcPr>
+          <w:p>
+            <w:r>
+              <w:t>0.998</w:t>
+            </w:r>
+          </w:p>
+        </w:tc>
+        <w:tc>
+          <w:tcPr>
+            <w:tcW w:type="dxa" w:w="2076"/>
+          </w:tcPr>
+          <w:p>
+            <w:r>
+              <w:t>0.998</w:t>
+            </w:r>
+          </w:p>
+        </w:tc>
+      </w:tr>
+      <w:tr>
+        <w:tc>
+          <w:tcPr>
+            <w:tcW w:type="dxa" w:w="2076"/>
+          </w:tcPr>
+          <w:p>
+            <w:r>
+              <w:t>spatiotemporal_only</w:t>
+            </w:r>
+          </w:p>
+        </w:tc>
+        <w:tc>
+          <w:tcPr>
+            <w:tcW w:type="dxa" w:w="2076"/>
+          </w:tcPr>
+          <w:p>
+            <w:r>
+              <w:t>0.528</w:t>
+            </w:r>
+          </w:p>
+        </w:tc>
+        <w:tc>
+          <w:tcPr>
+            <w:tcW w:type="dxa" w:w="2076"/>
+          </w:tcPr>
+          <w:p>
+            <w:r>
+              <w:t>0.396</w:t>
+            </w:r>
+          </w:p>
+        </w:tc>
+        <w:tc>
+          <w:tcPr>
+            <w:tcW w:type="dxa" w:w="2076"/>
+          </w:tcPr>
+          <w:p>
+            <w:r>
+              <w:t>0.228</w:t>
+            </w:r>
+          </w:p>
+        </w:tc>
+      </w:tr>
+    </w:tbl>
     <w:p>
       <w:r>
         <w:t>Supplementary Table S7. Binary administrative classification (Rural vs. Urban, excluding Transitional observations) under 30% simulated missingness.</w:t>

</xml_diff>

<commit_message>
Address SiM major revision: selection-bias, MAR/HP sensitivities, and presentation.
Add binary noise-injection, MAR beta1 grid, and hyperparameter perturbation analyses (S11–S13); lead Abstract with binary metrics; clarify LOYO decline, age/sex limits, and substantially definitional Transitional accuracy.

Co-authored-by: Cursor <cursoragent@cursor.com>
</commit_message>
<xml_diff>
--- a/public/Supplementary Material.docx
+++ b/public/Supplementary Material.docx
@@ -3914,6 +3914,575 @@
         </w:tc>
       </w:tr>
     </w:tbl>
+    <w:p>
+      <w:r>
+        <w:rPr>
+          <w:b/>
+        </w:rPr>
+        <w:t>Supplementary Table S11. Binary-task selection-bias sensitivity: Transitional exclusion versus collapse-by-T2 versus random 50/50 assignment (30% MCAR masking).</w:t>
+      </w:r>
+    </w:p>
+    <w:p>
+      <w:r>
+        <w:t>Primary binary excludes FatER 23–30%. Collapse-by-T2 retains all observations and assigns Transitional to their administrative T2. Random 50/50 injects label noise in the overlap region.</w:t>
+      </w:r>
+    </w:p>
+    <w:tbl>
+      <w:tblPr>
+        <w:tblW w:type="auto" w:w="0"/>
+        <w:tblLook w:firstColumn="1" w:firstRow="1" w:lastColumn="0" w:lastRow="0" w:noHBand="0" w:noVBand="1" w:val="04A0"/>
+      </w:tblPr>
+      <w:tblGrid>
+        <w:gridCol w:w="1440"/>
+        <w:gridCol w:w="1440"/>
+        <w:gridCol w:w="1440"/>
+        <w:gridCol w:w="1440"/>
+        <w:gridCol w:w="1440"/>
+        <w:gridCol w:w="1440"/>
+      </w:tblGrid>
+      <w:tr>
+        <w:tc>
+          <w:tcPr>
+            <w:tcW w:type="dxa" w:w="1440"/>
+          </w:tcPr>
+          <w:p>
+            <w:r>
+              <w:t>Scenario</w:t>
+            </w:r>
+          </w:p>
+        </w:tc>
+        <w:tc>
+          <w:tcPr>
+            <w:tcW w:type="dxa" w:w="1440"/>
+          </w:tcPr>
+          <w:p>
+            <w:r>
+              <w:t>N (test)</w:t>
+            </w:r>
+          </w:p>
+        </w:tc>
+        <w:tc>
+          <w:tcPr>
+            <w:tcW w:type="dxa" w:w="1440"/>
+          </w:tcPr>
+          <w:p>
+            <w:r>
+              <w:t>Masked accuracy</w:t>
+            </w:r>
+          </w:p>
+        </w:tc>
+        <w:tc>
+          <w:tcPr>
+            <w:tcW w:type="dxa" w:w="1440"/>
+          </w:tcPr>
+          <w:p>
+            <w:r>
+              <w:t>Masked F1</w:t>
+            </w:r>
+          </w:p>
+        </w:tc>
+        <w:tc>
+          <w:tcPr>
+            <w:tcW w:type="dxa" w:w="1440"/>
+          </w:tcPr>
+          <w:p>
+            <w:r>
+              <w:t>Holdout accuracy</w:t>
+            </w:r>
+          </w:p>
+        </w:tc>
+        <w:tc>
+          <w:tcPr>
+            <w:tcW w:type="dxa" w:w="1440"/>
+          </w:tcPr>
+          <w:p>
+            <w:r>
+              <w:t>Urban share</w:t>
+            </w:r>
+          </w:p>
+        </w:tc>
+      </w:tr>
+      <w:tr>
+        <w:tc>
+          <w:tcPr>
+            <w:tcW w:type="dxa" w:w="1440"/>
+          </w:tcPr>
+          <w:p>
+            <w:r>
+              <w:t>Exclude Transitional (primary)</w:t>
+            </w:r>
+          </w:p>
+        </w:tc>
+        <w:tc>
+          <w:tcPr>
+            <w:tcW w:type="dxa" w:w="1440"/>
+          </w:tcPr>
+          <w:p>
+            <w:r>
+              <w:t>15790</w:t>
+            </w:r>
+          </w:p>
+        </w:tc>
+        <w:tc>
+          <w:tcPr>
+            <w:tcW w:type="dxa" w:w="1440"/>
+          </w:tcPr>
+          <w:p>
+            <w:r>
+              <w:t>0.728</w:t>
+            </w:r>
+          </w:p>
+        </w:tc>
+        <w:tc>
+          <w:tcPr>
+            <w:tcW w:type="dxa" w:w="1440"/>
+          </w:tcPr>
+          <w:p>
+            <w:r>
+              <w:t>0.514</w:t>
+            </w:r>
+          </w:p>
+        </w:tc>
+        <w:tc>
+          <w:tcPr>
+            <w:tcW w:type="dxa" w:w="1440"/>
+          </w:tcPr>
+          <w:p>
+            <w:r>
+              <w:t>0.722</w:t>
+            </w:r>
+          </w:p>
+        </w:tc>
+        <w:tc>
+          <w:tcPr>
+            <w:tcW w:type="dxa" w:w="1440"/>
+          </w:tcPr>
+          <w:p>
+            <w:r>
+              <w:t>0.338</w:t>
+            </w:r>
+          </w:p>
+        </w:tc>
+      </w:tr>
+      <w:tr>
+        <w:tc>
+          <w:tcPr>
+            <w:tcW w:type="dxa" w:w="1440"/>
+          </w:tcPr>
+          <w:p>
+            <w:r>
+              <w:t>Collapse Transitional by T2</w:t>
+            </w:r>
+          </w:p>
+        </w:tc>
+        <w:tc>
+          <w:tcPr>
+            <w:tcW w:type="dxa" w:w="1440"/>
+          </w:tcPr>
+          <w:p>
+            <w:r>
+              <w:t>20386</w:t>
+            </w:r>
+          </w:p>
+        </w:tc>
+        <w:tc>
+          <w:tcPr>
+            <w:tcW w:type="dxa" w:w="1440"/>
+          </w:tcPr>
+          <w:p>
+            <w:r>
+              <w:t>0.721</w:t>
+            </w:r>
+          </w:p>
+        </w:tc>
+        <w:tc>
+          <w:tcPr>
+            <w:tcW w:type="dxa" w:w="1440"/>
+          </w:tcPr>
+          <w:p>
+            <w:r>
+              <w:t>0.487</w:t>
+            </w:r>
+          </w:p>
+        </w:tc>
+        <w:tc>
+          <w:tcPr>
+            <w:tcW w:type="dxa" w:w="1440"/>
+          </w:tcPr>
+          <w:p>
+            <w:r>
+              <w:t>0.719</w:t>
+            </w:r>
+          </w:p>
+        </w:tc>
+        <w:tc>
+          <w:tcPr>
+            <w:tcW w:type="dxa" w:w="1440"/>
+          </w:tcPr>
+          <w:p>
+            <w:r>
+              <w:t>0.334</w:t>
+            </w:r>
+          </w:p>
+        </w:tc>
+      </w:tr>
+      <w:tr>
+        <w:tc>
+          <w:tcPr>
+            <w:tcW w:type="dxa" w:w="1440"/>
+          </w:tcPr>
+          <w:p>
+            <w:r>
+              <w:t>Random 50/50 for Transitional</w:t>
+            </w:r>
+          </w:p>
+        </w:tc>
+        <w:tc>
+          <w:tcPr>
+            <w:tcW w:type="dxa" w:w="1440"/>
+          </w:tcPr>
+          <w:p>
+            <w:r>
+              <w:t>20386</w:t>
+            </w:r>
+          </w:p>
+        </w:tc>
+        <w:tc>
+          <w:tcPr>
+            <w:tcW w:type="dxa" w:w="1440"/>
+          </w:tcPr>
+          <w:p>
+            <w:r>
+              <w:t>0.667</w:t>
+            </w:r>
+          </w:p>
+        </w:tc>
+        <w:tc>
+          <w:tcPr>
+            <w:tcW w:type="dxa" w:w="1440"/>
+          </w:tcPr>
+          <w:p>
+            <w:r>
+              <w:t>0.485</w:t>
+            </w:r>
+          </w:p>
+        </w:tc>
+        <w:tc>
+          <w:tcPr>
+            <w:tcW w:type="dxa" w:w="1440"/>
+          </w:tcPr>
+          <w:p>
+            <w:r>
+              <w:t>0.671</w:t>
+            </w:r>
+          </w:p>
+        </w:tc>
+        <w:tc>
+          <w:tcPr>
+            <w:tcW w:type="dxa" w:w="1440"/>
+          </w:tcPr>
+          <w:p>
+            <w:r>
+              <w:t>0.375</w:t>
+            </w:r>
+          </w:p>
+        </w:tc>
+      </w:tr>
+    </w:tbl>
+    <w:p>
+      <w:r>
+        <w:rPr>
+          <w:b/>
+        </w:rPr>
+        <w:t>Supplementary Table S12. MAR propensity slope sensitivity (target realised missingness ≈ 30%).</w:t>
+      </w:r>
+    </w:p>
+    <w:tbl>
+      <w:tblPr>
+        <w:tblW w:type="auto" w:w="0"/>
+        <w:tblLook w:firstColumn="1" w:firstRow="1" w:lastColumn="0" w:lastRow="0" w:noHBand="0" w:noVBand="1" w:val="04A0"/>
+      </w:tblPr>
+      <w:tblGrid>
+        <w:gridCol w:w="1728"/>
+        <w:gridCol w:w="1728"/>
+        <w:gridCol w:w="1728"/>
+        <w:gridCol w:w="1728"/>
+        <w:gridCol w:w="1728"/>
+      </w:tblGrid>
+      <w:tr>
+        <w:tc>
+          <w:tcPr>
+            <w:tcW w:type="dxa" w:w="1728"/>
+          </w:tcPr>
+          <w:p>
+            <w:r>
+              <w:t>β₁</w:t>
+            </w:r>
+          </w:p>
+        </w:tc>
+        <w:tc>
+          <w:tcPr>
+            <w:tcW w:type="dxa" w:w="1728"/>
+          </w:tcPr>
+          <w:p>
+            <w:r>
+              <w:t>β₀</w:t>
+            </w:r>
+          </w:p>
+        </w:tc>
+        <w:tc>
+          <w:tcPr>
+            <w:tcW w:type="dxa" w:w="1728"/>
+          </w:tcPr>
+          <w:p>
+            <w:r>
+              <w:t>Realised rate</w:t>
+            </w:r>
+          </w:p>
+        </w:tc>
+        <w:tc>
+          <w:tcPr>
+            <w:tcW w:type="dxa" w:w="1728"/>
+          </w:tcPr>
+          <w:p>
+            <w:r>
+              <w:t>Accuracy</w:t>
+            </w:r>
+          </w:p>
+        </w:tc>
+        <w:tc>
+          <w:tcPr>
+            <w:tcW w:type="dxa" w:w="1728"/>
+          </w:tcPr>
+          <w:p>
+            <w:r>
+              <w:t>Macro-F1</w:t>
+            </w:r>
+          </w:p>
+        </w:tc>
+      </w:tr>
+      <w:tr>
+        <w:tc>
+          <w:tcPr>
+            <w:tcW w:type="dxa" w:w="1728"/>
+          </w:tcPr>
+          <w:p>
+            <w:r>
+              <w:t>1.0</w:t>
+            </w:r>
+          </w:p>
+        </w:tc>
+        <w:tc>
+          <w:tcPr>
+            <w:tcW w:type="dxa" w:w="1728"/>
+          </w:tcPr>
+          <w:p>
+            <w:r>
+              <w:t>-1.010</w:t>
+            </w:r>
+          </w:p>
+        </w:tc>
+        <w:tc>
+          <w:tcPr>
+            <w:tcW w:type="dxa" w:w="1728"/>
+          </w:tcPr>
+          <w:p>
+            <w:r>
+              <w:t>0.300</w:t>
+            </w:r>
+          </w:p>
+        </w:tc>
+        <w:tc>
+          <w:tcPr>
+            <w:tcW w:type="dxa" w:w="1728"/>
+          </w:tcPr>
+          <w:p>
+            <w:r>
+              <w:t>0.741</w:t>
+            </w:r>
+          </w:p>
+        </w:tc>
+        <w:tc>
+          <w:tcPr>
+            <w:tcW w:type="dxa" w:w="1728"/>
+          </w:tcPr>
+          <w:p>
+            <w:r>
+              <w:t>0.777</w:t>
+            </w:r>
+          </w:p>
+        </w:tc>
+      </w:tr>
+      <w:tr>
+        <w:tc>
+          <w:tcPr>
+            <w:tcW w:type="dxa" w:w="1728"/>
+          </w:tcPr>
+          <w:p>
+            <w:r>
+              <w:t>1.5</w:t>
+            </w:r>
+          </w:p>
+        </w:tc>
+        <w:tc>
+          <w:tcPr>
+            <w:tcW w:type="dxa" w:w="1728"/>
+          </w:tcPr>
+          <w:p>
+            <w:r>
+              <w:t>-1.168</w:t>
+            </w:r>
+          </w:p>
+        </w:tc>
+        <w:tc>
+          <w:tcPr>
+            <w:tcW w:type="dxa" w:w="1728"/>
+          </w:tcPr>
+          <w:p>
+            <w:r>
+              <w:t>0.300</w:t>
+            </w:r>
+          </w:p>
+        </w:tc>
+        <w:tc>
+          <w:tcPr>
+            <w:tcW w:type="dxa" w:w="1728"/>
+          </w:tcPr>
+          <w:p>
+            <w:r>
+              <w:t>0.722</w:t>
+            </w:r>
+          </w:p>
+        </w:tc>
+        <w:tc>
+          <w:tcPr>
+            <w:tcW w:type="dxa" w:w="1728"/>
+          </w:tcPr>
+          <w:p>
+            <w:r>
+              <w:t>0.773</w:t>
+            </w:r>
+          </w:p>
+        </w:tc>
+      </w:tr>
+      <w:tr>
+        <w:tc>
+          <w:tcPr>
+            <w:tcW w:type="dxa" w:w="1728"/>
+          </w:tcPr>
+          <w:p>
+            <w:r>
+              <w:t>2.0</w:t>
+            </w:r>
+          </w:p>
+        </w:tc>
+        <w:tc>
+          <w:tcPr>
+            <w:tcW w:type="dxa" w:w="1728"/>
+          </w:tcPr>
+          <w:p>
+            <w:r>
+              <w:t>-1.354</w:t>
+            </w:r>
+          </w:p>
+        </w:tc>
+        <w:tc>
+          <w:tcPr>
+            <w:tcW w:type="dxa" w:w="1728"/>
+          </w:tcPr>
+          <w:p>
+            <w:r>
+              <w:t>0.300</w:t>
+            </w:r>
+          </w:p>
+        </w:tc>
+        <w:tc>
+          <w:tcPr>
+            <w:tcW w:type="dxa" w:w="1728"/>
+          </w:tcPr>
+          <w:p>
+            <w:r>
+              <w:t>0.709</w:t>
+            </w:r>
+          </w:p>
+        </w:tc>
+        <w:tc>
+          <w:tcPr>
+            <w:tcW w:type="dxa" w:w="1728"/>
+          </w:tcPr>
+          <w:p>
+            <w:r>
+              <w:t>0.771</w:t>
+            </w:r>
+          </w:p>
+        </w:tc>
+      </w:tr>
+      <w:tr>
+        <w:tc>
+          <w:tcPr>
+            <w:tcW w:type="dxa" w:w="1728"/>
+          </w:tcPr>
+          <w:p>
+            <w:r>
+              <w:t>2.5</w:t>
+            </w:r>
+          </w:p>
+        </w:tc>
+        <w:tc>
+          <w:tcPr>
+            <w:tcW w:type="dxa" w:w="1728"/>
+          </w:tcPr>
+          <w:p>
+            <w:r>
+              <w:t>-1.557</w:t>
+            </w:r>
+          </w:p>
+        </w:tc>
+        <w:tc>
+          <w:tcPr>
+            <w:tcW w:type="dxa" w:w="1728"/>
+          </w:tcPr>
+          <w:p>
+            <w:r>
+              <w:t>0.300</w:t>
+            </w:r>
+          </w:p>
+        </w:tc>
+        <w:tc>
+          <w:tcPr>
+            <w:tcW w:type="dxa" w:w="1728"/>
+          </w:tcPr>
+          <w:p>
+            <w:r>
+              <w:t>0.701</w:t>
+            </w:r>
+          </w:p>
+        </w:tc>
+        <w:tc>
+          <w:tcPr>
+            <w:tcW w:type="dxa" w:w="1728"/>
+          </w:tcPr>
+          <w:p>
+            <w:r>
+              <w:t>0.771</w:t>
+            </w:r>
+          </w:p>
+        </w:tc>
+      </w:tr>
+    </w:tbl>
+    <w:p>
+      <w:r>
+        <w:rPr>
+          <w:b/>
+        </w:rPr>
+        <w:t>Supplementary Table S13. Hyperparameter perturbation summary (± neighbourhood of Table S6).</w:t>
+      </w:r>
+    </w:p>
+    <w:p>
+      <w:r>
+        <w:t>Across 28 settings of max_depth, learning_rate, and subsample, masked accuracy mean=0.782, SD=0.001, range [0.780, 0.784]; max |Δ| from baseline = 0.29 percentage points. Full grid in results/hyperparameter_perturbation.csv.</w:t>
+      </w:r>
+    </w:p>
     <w:sectPr>
       <w:pgSz w:w="12240" w:h="15840"/>
       <w:pgMar w:top="1440" w:right="1800" w:bottom="1440" w:left="1800" w:header="720" w:footer="720" w:gutter="0"/>

</xml_diff>